<commit_message>
Definiciones v3: margen logístico y plazo mínimo de 5 días en la fecha propuesta
La fecha propuesta de fabricación (familia y fin de ciclo) suma ahora
los 2 días de margen logístico. Si la familia se fabrica en los
próximos 5 días, se lleva la fecha de fabricación hasta el quinto día.
Los días que le quedan al ciclo se cuentan desde el día del cálculo.
Se quitan los puntos ya confirmados y la sección 3 queda como lo
pendiente de pasar al script.

Co-Authored-By: Claude Opus 5.5 <noreply@anthropic.com>
Claude-Session: https://claude.ai/code/session_019nRz4zLGpEPw6haAJH2jVp
</commit_message>
<xml_diff>
--- a/docs/Definiciones_Planificacion_AGSA.docx
+++ b/docs/Definiciones_Planificacion_AGSA.docx
@@ -30,7 +30,7 @@
           <w:sz w:val="20"/>
           <w:szCs w:val="20"/>
         </w:rPr>
-        <w:t>Versión 2 · 2 de octubre de 2026</w:t>
+        <w:t>Versión 3 · 2 de octubre de 2026</w:t>
       </w:r>
     </w:p>
     <w:p>
@@ -108,7 +108,7 @@
         <w:t>La familia está planificada.</w:t>
       </w:r>
       <w:r>
-        <w:t xml:space="preserve"> Si no hay stock suficiente y la familia del material está planificada, la fecha propuesta es el fin de fabricación de la familia en el primer ciclo en que aparece, sea el actual o el siguiente.</w:t>
+        <w:t xml:space="preserve"> Si no hay stock suficiente y la familia del material está planificada, se toma el fin de fabricación de la familia en el primer ciclo en que aparece, sea el actual o el siguiente. Si ese fin cae dentro de los próximos 5 días, se le suman los días que falten hasta 5: si se fabrica mañana, 4 días; si se fabrica dentro de 4 días, 1. La fecha propuesta es esa fecha más los 2 días de margen logístico.</w:t>
       </w:r>
     </w:p>
     <w:p>
@@ -148,7 +148,7 @@
         <w:t xml:space="preserve">La familia no está planificada y el pedido supera las 30 Tn.</w:t>
       </w:r>
       <w:r>
-        <w:t xml:space="preserve"> La fecha propuesta es el fin del ciclo actual de la máquina si a ese ciclo le quedan 5 días o más. Si le quedan menos de 5 días, es el fin del ciclo siguiente.</w:t>
+        <w:t xml:space="preserve"> Se toma el fin del ciclo actual de la máquina si a ese ciclo le quedan 5 días o más; si le quedan menos de 5 días, el fin del ciclo siguiente. La fecha propuesta es esa fecha más los 2 días de margen logístico.</w:t>
       </w:r>
     </w:p>
     <w:p>
@@ -724,7 +724,7 @@
                 <w:sz w:val="20"/>
                 <w:szCs w:val="20"/>
               </w:rPr>
-              <w:t>Fin de la familia en su primer ciclo planificado</w:t>
+              <w:t>Fin de la familia en su primer ciclo planificado (mínimo 5 días desde el cálculo) + 2 días</w:t>
             </w:r>
           </w:p>
         </w:tc>
@@ -884,7 +884,7 @@
                 <w:sz w:val="20"/>
                 <w:szCs w:val="20"/>
               </w:rPr>
-              <w:t>Fin del ciclo actual</w:t>
+              <w:t>Fin del ciclo actual + 2 días</w:t>
             </w:r>
           </w:p>
         </w:tc>
@@ -964,7 +964,7 @@
                 <w:sz w:val="20"/>
                 <w:szCs w:val="20"/>
               </w:rPr>
-              <w:t>Fin del ciclo siguiente. Si no está planificado, «Sin datos»</w:t>
+              <w:t>Fin del ciclo siguiente + 2 días. Si no está planificado, «Sin datos»</w:t>
             </w:r>
           </w:p>
         </w:tc>
@@ -1240,17 +1240,35 @@
           <w:ilvl w:val="0"/>
           <w:numId w:val="3"/>
         </w:numPr>
-        <w:jc w:val="both"/>
       </w:pPr>
       <w:r>
         <w:rPr>
           <w:b/>
           <w:bCs/>
         </w:rPr>
-        <w:t>Planificación que se tiene en cuenta:</w:t>
-      </w:r>
-      <w:r>
-        <w:t xml:space="preserve"> fabricaciones pendientes (estatus 0 y 1) de las máquinas 8, 16, 17, 20 y 28.</w:t>
+        <w:t xml:space="preserve">Plazo mínimo de fabricación:</w:t>
+      </w:r>
+      <w:r>
+        <w:t xml:space="preserve"> 5 días naturales desde el día del cálculo para que el pedido entre en la fabricación de su familia. Si la familia termina antes, se toma el quinto día.</w:t>
+      </w:r>
+    </w:p>
+    <w:p>
+      <w:pPr>
+        <w:pStyle w:val="Prrafodelista"/>
+        <w:numPr>
+          <w:ilvl w:val="0"/>
+          <w:numId w:val="3"/>
+        </w:numPr>
+      </w:pPr>
+      <w:r>
+        <w:rPr>
+          <w:b/>
+          <w:bCs/>
+        </w:rPr>
+        <w:t xml:space="preserve">Margen logístico:</w:t>
+      </w:r>
+      <w:r>
+        <w:t xml:space="preserve"> 2 días naturales para expedir y llegar a destino. La fecha propuesta siempre lo incluye, venga del stock, de la fabricación de la familia o del fin de ciclo.</w:t>
       </w:r>
     </w:p>
     <w:p>
@@ -1267,10 +1285,10 @@
           <w:b/>
           <w:bCs/>
         </w:rPr>
-        <w:t>Días que le quedan al ciclo:</w:t>
-      </w:r>
-      <w:r>
-        <w:t xml:space="preserve"> días naturales desde el día de la recarga hasta el fin del ciclo.</w:t>
+        <w:t>Planificación que se tiene en cuenta:</w:t>
+      </w:r>
+      <w:r>
+        <w:t xml:space="preserve"> fabricaciones pendientes (estatus 0 y 1) de las máquinas 8, 16, 17, 20 y 28.</w:t>
       </w:r>
     </w:p>
     <w:p>
@@ -1287,61 +1305,10 @@
           <w:b/>
           <w:bCs/>
         </w:rPr>
-        <w:t>Momento del cálculo:</w:t>
-      </w:r>
-      <w:r>
-        <w:t xml:space="preserve"> la fecha propuesta y la fecha errónea se calculan el día en que el pedido entra en la cartera, con el stock del día de creación y la planificación de ese día, y se mantienen después. Así el resultado de un pedido no cambia de un día a otro.</w:t>
-      </w:r>
-    </w:p>
-    <w:p>
-      <w:pPr>
-        <w:jc w:val="both"/>
-      </w:pPr>
-    </w:p>
-    <w:p>
-      <w:pPr>
-        <w:jc w:val="both"/>
-      </w:pPr>
-    </w:p>
-    <w:p>
-      <w:pPr>
-        <w:jc w:val="both"/>
-      </w:pPr>
-    </w:p>
-    <w:p>
-      <w:pPr>
-        <w:pStyle w:val="Ttulo1"/>
-        <w:jc w:val="both"/>
-      </w:pPr>
-      <w:r>
-        <w:lastRenderedPageBreak/>
-        <w:t>2. Tipo de atraso</w:t>
-      </w:r>
-    </w:p>
-    <w:p>
-      <w:pPr>
-        <w:pStyle w:val="Ttulo2"/>
-        <w:jc w:val="both"/>
-      </w:pPr>
-      <w:r>
-        <w:t xml:space="preserve">2.1 Qué indica</w:t>
-      </w:r>
-    </w:p>
-    <w:p>
-      <w:pPr>
-        <w:jc w:val="both"/>
-      </w:pPr>
-      <w:r>
-        <w:t xml:space="preserve">Clasifica cada posición abierta de la cartera según si va con retraso y, si es así, quién lo causa: comercial, planificación, producción o expedición.</w:t>
-      </w:r>
-    </w:p>
-    <w:p>
-      <w:pPr>
-        <w:pStyle w:val="Ttulo2"/>
-        <w:jc w:val="both"/>
-      </w:pPr>
-      <w:r>
-        <w:t xml:space="preserve">2.2 Fechas que intervienen</w:t>
+        <w:t>Días que le quedan al ciclo:</w:t>
+      </w:r>
+      <w:r>
+        <w:t xml:space="preserve"> días naturales desde el día del cálculo (el día en que entra el pedido) hasta el fin del ciclo.</w:t>
       </w:r>
     </w:p>
     <w:p>
@@ -1351,6 +1318,77 @@
           <w:ilvl w:val="0"/>
           <w:numId w:val="3"/>
         </w:numPr>
+        <w:jc w:val="both"/>
+      </w:pPr>
+      <w:r>
+        <w:rPr>
+          <w:b/>
+          <w:bCs/>
+        </w:rPr>
+        <w:t>Momento del cálculo:</w:t>
+      </w:r>
+      <w:r>
+        <w:t xml:space="preserve"> la fecha propuesta y la fecha errónea se calculan el día en que el pedido entra en la cartera, con el stock del día de creación y la planificación de ese día, y se mantienen después. Así el resultado de un pedido no cambia de un día a otro.</w:t>
+      </w:r>
+    </w:p>
+    <w:p>
+      <w:pPr>
+        <w:jc w:val="both"/>
+      </w:pPr>
+    </w:p>
+    <w:p>
+      <w:pPr>
+        <w:jc w:val="both"/>
+      </w:pPr>
+    </w:p>
+    <w:p>
+      <w:pPr>
+        <w:jc w:val="both"/>
+      </w:pPr>
+    </w:p>
+    <w:p>
+      <w:pPr>
+        <w:pStyle w:val="Ttulo1"/>
+        <w:jc w:val="both"/>
+      </w:pPr>
+      <w:r>
+        <w:lastRenderedPageBreak/>
+        <w:t>2. Tipo de atraso</w:t>
+      </w:r>
+    </w:p>
+    <w:p>
+      <w:pPr>
+        <w:pStyle w:val="Ttulo2"/>
+        <w:jc w:val="both"/>
+      </w:pPr>
+      <w:r>
+        <w:t xml:space="preserve">2.1 Qué indica</w:t>
+      </w:r>
+    </w:p>
+    <w:p>
+      <w:pPr>
+        <w:jc w:val="both"/>
+      </w:pPr>
+      <w:r>
+        <w:t xml:space="preserve">Clasifica cada posición abierta de la cartera según si va con retraso y, si es así, quién lo causa: comercial, planificación, producción o expedición.</w:t>
+      </w:r>
+    </w:p>
+    <w:p>
+      <w:pPr>
+        <w:pStyle w:val="Ttulo2"/>
+        <w:jc w:val="both"/>
+      </w:pPr>
+      <w:r>
+        <w:t xml:space="preserve">2.2 Fechas que intervienen</w:t>
+      </w:r>
+    </w:p>
+    <w:p>
+      <w:pPr>
+        <w:pStyle w:val="Prrafodelista"/>
+        <w:numPr>
+          <w:ilvl w:val="0"/>
+          <w:numId w:val="3"/>
+        </w:numPr>
       </w:pPr>
       <w:r>
         <w:rPr>
@@ -1436,7 +1474,7 @@
         <w:t xml:space="preserve">Fecha propuesta y fecha errónea:</w:t>
       </w:r>
       <w:r>
-        <w:t xml:space="preserve"> las del apartado 1. La fecha propuesta es el primer hueco posible en el stock o en los ciclos de fabricación.</w:t>
+        <w:t xml:space="preserve"> las del apartado 1. La fecha propuesta es el primer hueco posible en el stock o en los ciclos de fabricación, con el margen logístico de 2 días ya incluido.</w:t>
       </w:r>
     </w:p>
     <w:p>
@@ -2644,7 +2682,7 @@
       </w:pPr>
       <w:r>
         <w:lastRenderedPageBreak/>
-        <w:t xml:space="preserve">3.  Pendiente de confirmar</w:t>
+        <w:t xml:space="preserve">3. Pendiente de implementar</w:t>
       </w:r>
     </w:p>
     <w:p>
@@ -2656,109 +2694,7 @@
         </w:numPr>
       </w:pPr>
       <w:r>
-        <w:rPr>
-          <w:b/>
-          <w:bCs/>
-        </w:rPr>
-        <w:t xml:space="preserve">Límite de 30 Tn:</w:t>
-      </w:r>
-      <w:r>
-        <w:t xml:space="preserve"> se aplica a la cantidad de la posición. Si debe ser el total del pedido (todas sus posiciones), hay que cambiar el cálculo.</w:t>
-      </w:r>
-    </w:p>
-    <w:p>
-      <w:pPr>
-        <w:pStyle w:val="Prrafodelista"/>
-        <w:numPr>
-          <w:ilvl w:val="0"/>
-          <w:numId w:val="3"/>
-        </w:numPr>
-      </w:pPr>
-      <w:r>
-        <w:rPr>
-          <w:b/>
-          <w:bCs/>
-        </w:rPr>
-        <w:t>Materiales sin familia:</w:t>
-      </w:r>
-      <w:r>
-        <w:t xml:space="preserve"> cuando no hay stock suficiente salen «Sin datos» en fecha errónea, no «Sí».</w:t>
-      </w:r>
-    </w:p>
-    <w:p>
-      <w:pPr>
-        <w:pStyle w:val="Prrafodelista"/>
-        <w:numPr>
-          <w:ilvl w:val="0"/>
-          <w:numId w:val="3"/>
-        </w:numPr>
-      </w:pPr>
-      <w:r>
-        <w:rPr>
-          <w:b/>
-          <w:bCs/>
-        </w:rPr>
-        <w:t>Unidad de las órdenes de fabricación:</w:t>
-      </w:r>
-      <w:r>
-        <w:t xml:space="preserve"> se asume que la cantidad planificada viene en kg.</w:t>
-      </w:r>
-    </w:p>
-    <w:p>
-      <w:pPr>
-        <w:pStyle w:val="Prrafodelista"/>
-        <w:numPr>
-          <w:ilvl w:val="0"/>
-          <w:numId w:val="3"/>
-        </w:numPr>
-      </w:pPr>
-      <w:r>
-        <w:rPr>
-          <w:b/>
-          <w:bCs/>
-        </w:rPr>
-        <w:t xml:space="preserve">Margen de 2 días en la fecha propuesta de fabricación:</w:t>
-      </w:r>
-      <w:r>
-        <w:t xml:space="preserve"> cuando la fecha propuesta sale del stock ya incluye los 2 días (creación + 2); cuando sale de fabricación es el fin de fabricación, sin margen. Propuesta: sumarle también los 2 días. Si no, un pedido con entrega el mismo día en que acaba la fabricación sale con fecha correcta y llega tarde por fuerza.</w:t>
-      </w:r>
-    </w:p>
-    <w:p>
-      <w:pPr>
-        <w:pStyle w:val="Prrafodelista"/>
-        <w:numPr>
-          <w:ilvl w:val="0"/>
-          <w:numId w:val="3"/>
-        </w:numPr>
-      </w:pPr>
-      <w:r>
-        <w:rPr>
-          <w:b/>
-          <w:bCs/>
-        </w:rPr>
-        <w:t xml:space="preserve">«Pedido Modificado»:</w:t>
-      </w:r>
-      <w:r>
-        <w:t xml:space="preserve"> falta definir qué significa. Si es que se cambió la fecha de entrega después de meter el pedido, se detecta comparando la fecha de entrega actual con la que tenía al entrar, como un campo aparte y no como un tipo de atraso.</w:t>
-      </w:r>
-    </w:p>
-    <w:p>
-      <w:pPr>
-        <w:pStyle w:val="Prrafodelista"/>
-        <w:numPr>
-          <w:ilvl w:val="0"/>
-          <w:numId w:val="3"/>
-        </w:numPr>
-      </w:pPr>
-      <w:r>
-        <w:rPr>
-          <w:b/>
-          <w:bCs/>
-        </w:rPr>
-        <w:t xml:space="preserve">Implementación:</w:t>
-      </w:r>
-      <w:r>
-        <w:t xml:space="preserve"> el cálculo del tipo de atraso (apartado 2) y la fecha errónea del día de entrada (apartado 1.5) están pendientes de pasar al script de Qlik. Hasta entonces la app sigue con el cálculo anterior.</w:t>
+        <w:t xml:space="preserve">Están pendientes de pasar al script de Qlik el margen de 2 días y el plazo mínimo de 5 días en la fecha propuesta (apartado 1.2), la fecha errónea del día de entrada (apartado 1.5) y el cálculo del tipo de atraso (apartado 2). Hasta entonces la app sigue con el cálculo anterior.</w:t>
       </w:r>
     </w:p>
     <w:sectPr>

</xml_diff>

<commit_message>
Guarda la versión del Word editada por el usuario
Sin el apartado 1.5 ni el de pendientes de implementar. Es la versión
que se toma como referencia para pasar la lógica de atrasos al script.

Co-Authored-By: Claude Opus 5.5 <noreply@anthropic.com>
Claude-Session: https://claude.ai/code/session_019nRz4zLGpEPw6haAJH2jVp
</commit_message>
<xml_diff>
--- a/docs/Definiciones_Planificacion_AGSA.docx
+++ b/docs/Definiciones_Planificacion_AGSA.docx
@@ -19,22 +19,6 @@
     </w:p>
     <w:p>
       <w:pPr>
-        <w:pBdr>
-          <w:bottom w:val="single" w:sz="6" w:space="6" w:color="1F3864"/>
-        </w:pBdr>
-        <w:spacing w:after="240"/>
-      </w:pPr>
-      <w:r>
-        <w:rPr>
-          <w:color w:val="7F7F7F"/>
-          <w:sz w:val="20"/>
-          <w:szCs w:val="20"/>
-        </w:rPr>
-        <w:t>Versión 3 · 2 de octubre de 2026</w:t>
-      </w:r>
-    </w:p>
-    <w:p>
-      <w:pPr>
         <w:pStyle w:val="Ttulo1"/>
       </w:pPr>
       <w:r>
@@ -125,7 +109,7 @@
           <w:b/>
           <w:bCs/>
         </w:rPr>
-        <w:t xml:space="preserve">La familia no está planificada y el pedido es de 30 Tn o menos.</w:t>
+        <w:t>La familia no está planificada y el pedido es de 30 Tn o menos.</w:t>
       </w:r>
       <w:r>
         <w:t xml:space="preserve"> Si la familia no está planificada en ningún ciclo y el pedido no supera las 30 Tn, no se calcula fecha propuesta y la fecha se considera errónea directamente.</w:t>
@@ -145,7 +129,7 @@
           <w:b/>
           <w:bCs/>
         </w:rPr>
-        <w:t xml:space="preserve">La familia no está planificada y el pedido supera las 30 Tn.</w:t>
+        <w:t>La familia no está planificada y el pedido supera las 30 Tn.</w:t>
       </w:r>
       <w:r>
         <w:t xml:space="preserve"> Se toma el fin del ciclo actual de la máquina si a ese ciclo le quedan 5 días o más; si le quedan menos de 5 días, el fin del ciclo siguiente. La fecha propuesta es esa fecha más los 2 días de margen logístico.</w:t>
@@ -156,7 +140,7 @@
         <w:jc w:val="both"/>
       </w:pPr>
       <w:r>
-        <w:t xml:space="preserve">No se puede calcular la fecha propuesta, y el resultado es «Sin datos», cuando no hay foto de stock del día de creación del pedido, cuando el material no tiene familia asignada o cuando la máquina no tiene planificado un ciclo.</w:t>
+        <w:t>No se puede calcular la fecha propuesta, y el resultado es «Sin datos», cuando no hay foto de stock del día de creación del pedido, cuando el material no tiene familia asignada o cuando la máquina no tiene planificado un ciclo.</w:t>
       </w:r>
     </w:p>
     <w:p>
@@ -189,12 +173,6 @@
         <w:gridCol w:w="7638"/>
       </w:tblGrid>
       <w:tr>
-        <w:tblPrEx>
-          <w:tblCellMar>
-            <w:top w:w="0" w:type="dxa"/>
-            <w:bottom w:w="0" w:type="dxa"/>
-          </w:tblCellMar>
-        </w:tblPrEx>
         <w:trPr>
           <w:cantSplit/>
           <w:tblHeader/>
@@ -253,12 +231,6 @@
         </w:tc>
       </w:tr>
       <w:tr>
-        <w:tblPrEx>
-          <w:tblCellMar>
-            <w:top w:w="0" w:type="dxa"/>
-            <w:bottom w:w="0" w:type="dxa"/>
-          </w:tblCellMar>
-        </w:tblPrEx>
         <w:trPr>
           <w:cantSplit/>
         </w:trPr>
@@ -304,18 +276,12 @@
                 <w:sz w:val="20"/>
                 <w:szCs w:val="20"/>
               </w:rPr>
-              <w:t xml:space="preserve">La fecha de entrega es anterior a la fecha propuesta, o la familia no está planificada y el pedido es de 30 Tn o menos.</w:t>
+              <w:t>La fecha de entrega es anterior a la fecha propuesta, o la familia no está planificada y el pedido es de 30 Tn o menos.</w:t>
             </w:r>
           </w:p>
         </w:tc>
       </w:tr>
       <w:tr>
-        <w:tblPrEx>
-          <w:tblCellMar>
-            <w:top w:w="0" w:type="dxa"/>
-            <w:bottom w:w="0" w:type="dxa"/>
-          </w:tblCellMar>
-        </w:tblPrEx>
         <w:trPr>
           <w:cantSplit/>
         </w:trPr>
@@ -367,12 +333,6 @@
         </w:tc>
       </w:tr>
       <w:tr>
-        <w:tblPrEx>
-          <w:tblCellMar>
-            <w:top w:w="0" w:type="dxa"/>
-            <w:bottom w:w="0" w:type="dxa"/>
-          </w:tblCellMar>
-        </w:tblPrEx>
         <w:trPr>
           <w:cantSplit/>
         </w:trPr>
@@ -480,12 +440,6 @@
         <w:gridCol w:w="2700"/>
       </w:tblGrid>
       <w:tr>
-        <w:tblPrEx>
-          <w:tblCellMar>
-            <w:top w:w="0" w:type="dxa"/>
-            <w:bottom w:w="0" w:type="dxa"/>
-          </w:tblCellMar>
-        </w:tblPrEx>
         <w:trPr>
           <w:cantSplit/>
           <w:tblHeader/>
@@ -538,7 +492,7 @@
                 <w:sz w:val="20"/>
                 <w:szCs w:val="20"/>
               </w:rPr>
-              <w:t xml:space="preserve">Cuándo se aplica</w:t>
+              <w:t>Cuándo se aplica</w:t>
             </w:r>
           </w:p>
         </w:tc>
@@ -570,12 +524,6 @@
         </w:tc>
       </w:tr>
       <w:tr>
-        <w:tblPrEx>
-          <w:tblCellMar>
-            <w:top w:w="0" w:type="dxa"/>
-            <w:bottom w:w="0" w:type="dxa"/>
-          </w:tblCellMar>
-        </w:tblPrEx>
         <w:trPr>
           <w:cantSplit/>
         </w:trPr>
@@ -650,12 +598,6 @@
         </w:tc>
       </w:tr>
       <w:tr>
-        <w:tblPrEx>
-          <w:tblCellMar>
-            <w:top w:w="0" w:type="dxa"/>
-            <w:bottom w:w="0" w:type="dxa"/>
-          </w:tblCellMar>
-        </w:tblPrEx>
         <w:trPr>
           <w:cantSplit/>
         </w:trPr>
@@ -730,12 +672,6 @@
         </w:tc>
       </w:tr>
       <w:tr>
-        <w:tblPrEx>
-          <w:tblCellMar>
-            <w:top w:w="0" w:type="dxa"/>
-            <w:bottom w:w="0" w:type="dxa"/>
-          </w:tblCellMar>
-        </w:tblPrEx>
         <w:trPr>
           <w:cantSplit/>
         </w:trPr>
@@ -781,7 +717,7 @@
                 <w:sz w:val="20"/>
                 <w:szCs w:val="20"/>
               </w:rPr>
-              <w:t xml:space="preserve">Familia sin planificar y pedido de 30 Tn o menos</w:t>
+              <w:t>Familia sin planificar y pedido de 30 Tn o menos</w:t>
             </w:r>
           </w:p>
         </w:tc>
@@ -810,12 +746,6 @@
         </w:tc>
       </w:tr>
       <w:tr>
-        <w:tblPrEx>
-          <w:tblCellMar>
-            <w:top w:w="0" w:type="dxa"/>
-            <w:bottom w:w="0" w:type="dxa"/>
-          </w:tblCellMar>
-        </w:tblPrEx>
         <w:trPr>
           <w:cantSplit/>
         </w:trPr>
@@ -861,7 +791,7 @@
                 <w:sz w:val="20"/>
                 <w:szCs w:val="20"/>
               </w:rPr>
-              <w:t xml:space="preserve">Familia sin planificar, pedido de más de 30 Tn y al ciclo actual le quedan 5 días o más</w:t>
+              <w:t>Familia sin planificar, pedido de más de 30 Tn y al ciclo actual le quedan 5 días o más</w:t>
             </w:r>
           </w:p>
         </w:tc>
@@ -890,12 +820,6 @@
         </w:tc>
       </w:tr>
       <w:tr>
-        <w:tblPrEx>
-          <w:tblCellMar>
-            <w:top w:w="0" w:type="dxa"/>
-            <w:bottom w:w="0" w:type="dxa"/>
-          </w:tblCellMar>
-        </w:tblPrEx>
         <w:trPr>
           <w:cantSplit/>
         </w:trPr>
@@ -941,7 +865,7 @@
                 <w:sz w:val="20"/>
                 <w:szCs w:val="20"/>
               </w:rPr>
-              <w:t xml:space="preserve">Familia sin planificar, pedido de más de 30 Tn y al ciclo actual le quedan menos de 5 días</w:t>
+              <w:t>Familia sin planificar, pedido de más de 30 Tn y al ciclo actual le quedan menos de 5 días</w:t>
             </w:r>
           </w:p>
         </w:tc>
@@ -970,12 +894,6 @@
         </w:tc>
       </w:tr>
       <w:tr>
-        <w:tblPrEx>
-          <w:tblCellMar>
-            <w:top w:w="0" w:type="dxa"/>
-            <w:bottom w:w="0" w:type="dxa"/>
-          </w:tblCellMar>
-        </w:tblPrEx>
         <w:trPr>
           <w:cantSplit/>
         </w:trPr>
@@ -1050,12 +968,6 @@
         </w:tc>
       </w:tr>
       <w:tr>
-        <w:tblPrEx>
-          <w:tblCellMar>
-            <w:top w:w="0" w:type="dxa"/>
-            <w:bottom w:w="0" w:type="dxa"/>
-          </w:tblCellMar>
-        </w:tblPrEx>
         <w:trPr>
           <w:cantSplit/>
         </w:trPr>
@@ -1137,10 +1049,53 @@
     </w:p>
     <w:p>
       <w:pPr>
+        <w:jc w:val="both"/>
+      </w:pPr>
+    </w:p>
+    <w:p>
+      <w:pPr>
+        <w:jc w:val="both"/>
+      </w:pPr>
+    </w:p>
+    <w:p>
+      <w:r>
+        <w:br w:type="page"/>
+      </w:r>
+    </w:p>
+    <w:p>
+      <w:pPr>
+        <w:pStyle w:val="Ttulo1"/>
+        <w:jc w:val="both"/>
+      </w:pPr>
+      <w:r>
+        <w:lastRenderedPageBreak/>
+        <w:t>2. Tipo de atraso</w:t>
+      </w:r>
+    </w:p>
+    <w:p>
+      <w:pPr>
         <w:pStyle w:val="Ttulo2"/>
-      </w:pPr>
-      <w:r>
-        <w:t>1.5 Definiciones y criterios</w:t>
+        <w:jc w:val="both"/>
+      </w:pPr>
+      <w:r>
+        <w:t>2.1 Qué indica</w:t>
+      </w:r>
+    </w:p>
+    <w:p>
+      <w:pPr>
+        <w:jc w:val="both"/>
+      </w:pPr>
+      <w:r>
+        <w:t>Clasifica cada posición abierta de la cartera según si va con retraso y, si es así, quién lo causa: comercial, planificación, producción o expedición.</w:t>
+      </w:r>
+    </w:p>
+    <w:p>
+      <w:pPr>
+        <w:pStyle w:val="Ttulo2"/>
+        <w:jc w:val="both"/>
+      </w:pPr>
+      <w:r>
+        <w:t>2.2 Fechas que intervienen</w:t>
       </w:r>
     </w:p>
     <w:p>
@@ -1150,17 +1105,16 @@
           <w:ilvl w:val="0"/>
           <w:numId w:val="3"/>
         </w:numPr>
-        <w:jc w:val="both"/>
       </w:pPr>
       <w:r>
         <w:rPr>
           <w:b/>
           <w:bCs/>
         </w:rPr>
-        <w:t>Cantidad del pedido:</w:t>
-      </w:r>
-      <w:r>
-        <w:t xml:space="preserve"> la de la posición (pedido-posición), en kg. 30 Tn son 30.000 kg.</w:t>
+        <w:t>Stock reservado suficiente:</w:t>
+      </w:r>
+      <w:r>
+        <w:t xml:space="preserve"> el stock asignado a la posición cubre al menos el 90 % de su cantidad pendiente.</w:t>
       </w:r>
     </w:p>
     <w:p>
@@ -1170,17 +1124,16 @@
           <w:ilvl w:val="0"/>
           <w:numId w:val="3"/>
         </w:numPr>
-        <w:jc w:val="both"/>
       </w:pPr>
       <w:r>
         <w:rPr>
           <w:b/>
           <w:bCs/>
         </w:rPr>
-        <w:t>Stock libre:</w:t>
-      </w:r>
-      <w:r>
-        <w:t xml:space="preserve"> stock de libre utilización del material no asignado a pedidos, según la foto de stock del día de creación del pedido.</w:t>
+        <w:t>Fecha de reserva:</w:t>
+      </w:r>
+      <w:r>
+        <w:t xml:space="preserve"> la primera fecha en que se reservó stock para la posición.</w:t>
       </w:r>
     </w:p>
     <w:p>
@@ -1190,27 +1143,16 @@
           <w:ilvl w:val="0"/>
           <w:numId w:val="3"/>
         </w:numPr>
-        <w:jc w:val="both"/>
       </w:pPr>
       <w:r>
         <w:rPr>
           <w:b/>
           <w:bCs/>
         </w:rPr>
-        <w:t>Ciclo actual de una máquina:</w:t>
-      </w:r>
-      <w:r>
-        <w:t xml:space="preserve"> el primer ciclo planificado que todavía no ha terminado. </w:t>
-      </w:r>
-      <w:r>
-        <w:rPr>
-          <w:b/>
-          <w:bCs/>
-        </w:rPr>
-        <w:t>Fin de un ciclo:</w:t>
-      </w:r>
-      <w:r>
-        <w:t xml:space="preserve"> el último fin previsto de las fabricaciones de ese ciclo.</w:t>
+        <w:t>Fecha de disponibilidad:</w:t>
+      </w:r>
+      <w:r>
+        <w:t xml:space="preserve"> la que da planificación cuando planifica el pedido, o el material contra stock si no hay stock disponible. Hasta entonces la posición no tiene fecha de disponibilidad. Planificación la actualiza como mínimo al día actual.</w:t>
       </w:r>
     </w:p>
     <w:p>
@@ -1220,17 +1162,16 @@
           <w:ilvl w:val="0"/>
           <w:numId w:val="3"/>
         </w:numPr>
-        <w:jc w:val="both"/>
       </w:pPr>
       <w:r>
         <w:rPr>
           <w:b/>
           <w:bCs/>
         </w:rPr>
-        <w:t>Fin de fabricación de la familia:</w:t>
-      </w:r>
-      <w:r>
-        <w:t xml:space="preserve"> el último fin previsto de las fabricaciones de la familia dentro de ese ciclo.</w:t>
+        <w:t>Primera fecha de disponibilidad:</w:t>
+      </w:r>
+      <w:r>
+        <w:t xml:space="preserve"> la primera que dio planificación. Permite saber si planificación dio una fecha tarde desde el principio o si el pedido se ha retrasado después.</w:t>
       </w:r>
     </w:p>
     <w:p>
@@ -1246,10 +1187,10 @@
           <w:b/>
           <w:bCs/>
         </w:rPr>
-        <w:t xml:space="preserve">Plazo mínimo de fabricación:</w:t>
-      </w:r>
-      <w:r>
-        <w:t xml:space="preserve"> 5 días naturales desde el día del cálculo para que el pedido entre en la fabricación de su familia. Si la familia termina antes, se toma el quinto día.</w:t>
+        <w:t>Fecha propuesta y fecha errónea:</w:t>
+      </w:r>
+      <w:r>
+        <w:t xml:space="preserve"> las del apartado 1. La fecha propuesta es el primer hueco posible en el stock o en los ciclos de fabricación, con el margen logístico de 2 días ya incluido.</w:t>
       </w:r>
     </w:p>
     <w:p>
@@ -1265,95 +1206,10 @@
           <w:b/>
           <w:bCs/>
         </w:rPr>
-        <w:t xml:space="preserve">Margen logístico:</w:t>
-      </w:r>
-      <w:r>
-        <w:t xml:space="preserve"> 2 días naturales para expedir y llegar a destino. La fecha propuesta siempre lo incluye, venga del stock, de la fabricación de la familia o del fin de ciclo.</w:t>
-      </w:r>
-    </w:p>
-    <w:p>
-      <w:pPr>
-        <w:pStyle w:val="Prrafodelista"/>
-        <w:numPr>
-          <w:ilvl w:val="0"/>
-          <w:numId w:val="3"/>
-        </w:numPr>
-        <w:jc w:val="both"/>
-      </w:pPr>
-      <w:r>
-        <w:rPr>
-          <w:b/>
-          <w:bCs/>
-        </w:rPr>
-        <w:t>Planificación que se tiene en cuenta:</w:t>
-      </w:r>
-      <w:r>
-        <w:t xml:space="preserve"> fabricaciones pendientes (estatus 0 y 1) de las máquinas 8, 16, 17, 20 y 28.</w:t>
-      </w:r>
-    </w:p>
-    <w:p>
-      <w:pPr>
-        <w:pStyle w:val="Prrafodelista"/>
-        <w:numPr>
-          <w:ilvl w:val="0"/>
-          <w:numId w:val="3"/>
-        </w:numPr>
-        <w:jc w:val="both"/>
-      </w:pPr>
-      <w:r>
-        <w:rPr>
-          <w:b/>
-          <w:bCs/>
-        </w:rPr>
-        <w:t>Días que le quedan al ciclo:</w:t>
-      </w:r>
-      <w:r>
-        <w:t xml:space="preserve"> días naturales desde el día del cálculo (el día en que entra el pedido) hasta el fin del ciclo.</w:t>
-      </w:r>
-    </w:p>
-    <w:p>
-      <w:pPr>
-        <w:pStyle w:val="Prrafodelista"/>
-        <w:numPr>
-          <w:ilvl w:val="0"/>
-          <w:numId w:val="3"/>
-        </w:numPr>
-        <w:jc w:val="both"/>
-      </w:pPr>
-      <w:r>
-        <w:rPr>
-          <w:b/>
-          <w:bCs/>
-        </w:rPr>
-        <w:t>Momento del cálculo:</w:t>
-      </w:r>
-      <w:r>
-        <w:t xml:space="preserve"> la fecha propuesta y la fecha errónea se calculan el día en que el pedido entra en la cartera, con el stock del día de creación y la planificación de ese día, y se mantienen después. Así el resultado de un pedido no cambia de un día a otro.</w:t>
-      </w:r>
-    </w:p>
-    <w:p>
-      <w:pPr>
-        <w:jc w:val="both"/>
-      </w:pPr>
-    </w:p>
-    <w:p>
-      <w:pPr>
-        <w:jc w:val="both"/>
-      </w:pPr>
-    </w:p>
-    <w:p>
-      <w:pPr>
-        <w:jc w:val="both"/>
-      </w:pPr>
-    </w:p>
-    <w:p>
-      <w:pPr>
-        <w:pStyle w:val="Ttulo1"/>
-        <w:jc w:val="both"/>
-      </w:pPr>
-      <w:r>
-        <w:lastRenderedPageBreak/>
-        <w:t>2. Tipo de atraso</w:t>
+        <w:t>Llegar a tiempo a una fecha:</w:t>
+      </w:r>
+      <w:r>
+        <w:t xml:space="preserve"> que el material esté reservado o disponible al menos 2 días antes de esa fecha, el margen para expedir y llegar a destino.</w:t>
       </w:r>
     </w:p>
     <w:p>
@@ -1362,7 +1218,7 @@
         <w:jc w:val="both"/>
       </w:pPr>
       <w:r>
-        <w:t xml:space="preserve">2.1 Qué indica</w:t>
+        <w:t>2.3 Cómo se calcula</w:t>
       </w:r>
     </w:p>
     <w:p>
@@ -1370,147 +1226,7 @@
         <w:jc w:val="both"/>
       </w:pPr>
       <w:r>
-        <w:t xml:space="preserve">Clasifica cada posición abierta de la cartera según si va con retraso y, si es así, quién lo causa: comercial, planificación, producción o expedición.</w:t>
-      </w:r>
-    </w:p>
-    <w:p>
-      <w:pPr>
-        <w:pStyle w:val="Ttulo2"/>
-        <w:jc w:val="both"/>
-      </w:pPr>
-      <w:r>
-        <w:t xml:space="preserve">2.2 Fechas que intervienen</w:t>
-      </w:r>
-    </w:p>
-    <w:p>
-      <w:pPr>
-        <w:pStyle w:val="Prrafodelista"/>
-        <w:numPr>
-          <w:ilvl w:val="0"/>
-          <w:numId w:val="3"/>
-        </w:numPr>
-      </w:pPr>
-      <w:r>
-        <w:rPr>
-          <w:b/>
-          <w:bCs/>
-        </w:rPr>
-        <w:t xml:space="preserve">Stock reservado suficiente:</w:t>
-      </w:r>
-      <w:r>
-        <w:t xml:space="preserve"> el stock asignado a la posición cubre al menos el 90 % de su cantidad pendiente.</w:t>
-      </w:r>
-    </w:p>
-    <w:p>
-      <w:pPr>
-        <w:pStyle w:val="Prrafodelista"/>
-        <w:numPr>
-          <w:ilvl w:val="0"/>
-          <w:numId w:val="3"/>
-        </w:numPr>
-      </w:pPr>
-      <w:r>
-        <w:rPr>
-          <w:b/>
-          <w:bCs/>
-        </w:rPr>
-        <w:t xml:space="preserve">Fecha de reserva:</w:t>
-      </w:r>
-      <w:r>
-        <w:t xml:space="preserve"> la primera fecha en que se reservó stock para la posición.</w:t>
-      </w:r>
-    </w:p>
-    <w:p>
-      <w:pPr>
-        <w:pStyle w:val="Prrafodelista"/>
-        <w:numPr>
-          <w:ilvl w:val="0"/>
-          <w:numId w:val="3"/>
-        </w:numPr>
-      </w:pPr>
-      <w:r>
-        <w:rPr>
-          <w:b/>
-          <w:bCs/>
-        </w:rPr>
-        <w:t xml:space="preserve">Fecha de disponibilidad:</w:t>
-      </w:r>
-      <w:r>
-        <w:t xml:space="preserve"> la que da planificación cuando planifica el pedido, o el material contra stock si no hay stock disponible. Hasta entonces la posición no tiene fecha de disponibilidad. Planificación la actualiza como mínimo al día actual.</w:t>
-      </w:r>
-    </w:p>
-    <w:p>
-      <w:pPr>
-        <w:pStyle w:val="Prrafodelista"/>
-        <w:numPr>
-          <w:ilvl w:val="0"/>
-          <w:numId w:val="3"/>
-        </w:numPr>
-      </w:pPr>
-      <w:r>
-        <w:rPr>
-          <w:b/>
-          <w:bCs/>
-        </w:rPr>
-        <w:t xml:space="preserve">Primera fecha de disponibilidad:</w:t>
-      </w:r>
-      <w:r>
-        <w:t xml:space="preserve"> la primera que dio planificación. Permite saber si planificación dio una fecha tarde desde el principio o si el pedido se ha retrasado después.</w:t>
-      </w:r>
-    </w:p>
-    <w:p>
-      <w:pPr>
-        <w:pStyle w:val="Prrafodelista"/>
-        <w:numPr>
-          <w:ilvl w:val="0"/>
-          <w:numId w:val="3"/>
-        </w:numPr>
-      </w:pPr>
-      <w:r>
-        <w:rPr>
-          <w:b/>
-          <w:bCs/>
-        </w:rPr>
-        <w:t xml:space="preserve">Fecha propuesta y fecha errónea:</w:t>
-      </w:r>
-      <w:r>
-        <w:t xml:space="preserve"> las del apartado 1. La fecha propuesta es el primer hueco posible en el stock o en los ciclos de fabricación, con el margen logístico de 2 días ya incluido.</w:t>
-      </w:r>
-    </w:p>
-    <w:p>
-      <w:pPr>
-        <w:pStyle w:val="Prrafodelista"/>
-        <w:numPr>
-          <w:ilvl w:val="0"/>
-          <w:numId w:val="3"/>
-        </w:numPr>
-      </w:pPr>
-      <w:r>
-        <w:rPr>
-          <w:b/>
-          <w:bCs/>
-        </w:rPr>
-        <w:t xml:space="preserve">Llegar a tiempo a una fecha:</w:t>
-      </w:r>
-      <w:r>
-        <w:t xml:space="preserve"> que el material esté reservado o disponible al menos 2 días antes de esa fecha, el margen para expedir y llegar a destino.</w:t>
-      </w:r>
-    </w:p>
-    <w:p>
-      <w:pPr>
-        <w:pStyle w:val="Ttulo2"/>
-        <w:jc w:val="both"/>
-      </w:pPr>
-      <w:r>
-        <w:t xml:space="preserve">2.3 Cómo se calcula</w:t>
-      </w:r>
-    </w:p>
-    <w:p>
-      <w:pPr>
-        <w:jc w:val="both"/>
-      </w:pPr>
-      <w:r>
-        <w:t xml:space="preserve">Se distinguen tres casos según el stock reservado y la fecha de disponibilidad. En cada caso se aplica la primera fila que se cumple.</w:t>
+        <w:t xml:space="preserve">Se distinguen tres casos según el stock reservado y la fecha de disponibilidad. </w:t>
       </w:r>
     </w:p>
     <w:p>
@@ -1524,7 +1240,7 @@
           <w:bCs/>
           <w:color w:val="1F3864"/>
         </w:rPr>
-        <w:t xml:space="preserve">Caso 1. Con stock reservado suficiente</w:t>
+        <w:t>Caso 1. Con stock reservado suficiente</w:t>
       </w:r>
     </w:p>
     <w:tbl>
@@ -1576,7 +1292,7 @@
                 <w:sz w:val="20"/>
                 <w:szCs w:val="20"/>
               </w:rPr>
-              <w:t xml:space="preserve">Condición</w:t>
+              <w:t>Condición</w:t>
             </w:r>
           </w:p>
         </w:tc>
@@ -1602,7 +1318,7 @@
                 <w:sz w:val="20"/>
                 <w:szCs w:val="20"/>
               </w:rPr>
-              <w:t xml:space="preserve">Tipo_Atraso</w:t>
+              <w:t>Tipo_Atraso</w:t>
             </w:r>
           </w:p>
         </w:tc>
@@ -1630,7 +1346,7 @@
                 <w:sz w:val="20"/>
                 <w:szCs w:val="20"/>
               </w:rPr>
-              <w:t xml:space="preserve">La fecha de entrega aún no ha pasado</w:t>
+              <w:t>La fecha de entrega aún no ha pasado</w:t>
             </w:r>
           </w:p>
         </w:tc>
@@ -1653,7 +1369,7 @@
                 <w:sz w:val="20"/>
                 <w:szCs w:val="20"/>
               </w:rPr>
-              <w:t xml:space="preserve">«Sin Atraso»</w:t>
+              <w:t>«Sin Atraso»</w:t>
             </w:r>
           </w:p>
         </w:tc>
@@ -1681,7 +1397,7 @@
                 <w:sz w:val="20"/>
                 <w:szCs w:val="20"/>
               </w:rPr>
-              <w:t xml:space="preserve">Se reservó al menos 2 días antes de la fecha de entrega</w:t>
+              <w:t>Se reservó al menos 2 días antes de la fecha de entrega</w:t>
             </w:r>
           </w:p>
         </w:tc>
@@ -1704,7 +1420,7 @@
                 <w:sz w:val="20"/>
                 <w:szCs w:val="20"/>
               </w:rPr>
-              <w:t xml:space="preserve">«Atraso Expedicion»</w:t>
+              <w:t>«Atraso Expedicion»</w:t>
             </w:r>
           </w:p>
         </w:tc>
@@ -1732,7 +1448,7 @@
                 <w:sz w:val="20"/>
                 <w:szCs w:val="20"/>
               </w:rPr>
-              <w:t xml:space="preserve">La fecha era errónea y se reservó a tiempo para la fecha propuesta</w:t>
+              <w:t>La fecha era errónea y se reservó a tiempo para la fecha propuesta</w:t>
             </w:r>
           </w:p>
         </w:tc>
@@ -1755,7 +1471,7 @@
                 <w:sz w:val="20"/>
                 <w:szCs w:val="20"/>
               </w:rPr>
-              <w:t xml:space="preserve">«Atraso Comercial»</w:t>
+              <w:t>«Atraso Comercial»</w:t>
             </w:r>
           </w:p>
         </w:tc>
@@ -1783,7 +1499,7 @@
                 <w:sz w:val="20"/>
                 <w:szCs w:val="20"/>
               </w:rPr>
-              <w:t xml:space="preserve">La primera fecha de disponibilidad no llegaba a tiempo ni para la entrega ni para la fecha propuesta, o la posición nunca tuvo fecha de disponibilidad</w:t>
+              <w:t>La primera fecha de disponibilidad no llegaba a tiempo ni para la entrega ni para la fecha propuesta, o la posición nunca tuvo fecha de disponibilidad</w:t>
             </w:r>
           </w:p>
         </w:tc>
@@ -1806,7 +1522,7 @@
                 <w:sz w:val="20"/>
                 <w:szCs w:val="20"/>
               </w:rPr>
-              <w:t xml:space="preserve">«Atraso Planificacion»</w:t>
+              <w:t>«Atraso Planificacion»</w:t>
             </w:r>
           </w:p>
         </w:tc>
@@ -1834,7 +1550,7 @@
                 <w:sz w:val="20"/>
                 <w:szCs w:val="20"/>
               </w:rPr>
-              <w:t xml:space="preserve">En cualquier otro caso</w:t>
+              <w:t>En cualquier otro caso</w:t>
             </w:r>
           </w:p>
         </w:tc>
@@ -1857,7 +1573,7 @@
                 <w:sz w:val="20"/>
                 <w:szCs w:val="20"/>
               </w:rPr>
-              <w:t xml:space="preserve">«Atraso Produccion»</w:t>
+              <w:t>«Atraso Produccion»</w:t>
             </w:r>
           </w:p>
         </w:tc>
@@ -1879,7 +1595,7 @@
           <w:bCs/>
           <w:color w:val="1F3864"/>
         </w:rPr>
-        <w:t xml:space="preserve">Caso 2. Sin stock reservado suficiente y sin fecha de disponibilidad (todavía no planificado)</w:t>
+        <w:t>Caso 2. Sin stock reservado suficiente y sin fecha de disponibilidad (todavía no planificado)</w:t>
       </w:r>
     </w:p>
     <w:tbl>
@@ -1931,7 +1647,7 @@
                 <w:sz w:val="20"/>
                 <w:szCs w:val="20"/>
               </w:rPr>
-              <w:t xml:space="preserve">Condición</w:t>
+              <w:t>Condición</w:t>
             </w:r>
           </w:p>
         </w:tc>
@@ -1957,7 +1673,7 @@
                 <w:sz w:val="20"/>
                 <w:szCs w:val="20"/>
               </w:rPr>
-              <w:t xml:space="preserve">Tipo_Atraso</w:t>
+              <w:t>Tipo_Atraso</w:t>
             </w:r>
           </w:p>
         </w:tc>
@@ -1985,7 +1701,7 @@
                 <w:sz w:val="20"/>
                 <w:szCs w:val="20"/>
               </w:rPr>
-              <w:t xml:space="preserve">La fecha era errónea y la fecha propuesta aún no ha pasado, o no hay fecha propuesta</w:t>
+              <w:t>La fecha era errónea y la fecha propuesta aún no ha pasado, o no hay fecha propuesta</w:t>
             </w:r>
           </w:p>
         </w:tc>
@@ -2008,7 +1724,7 @@
                 <w:sz w:val="20"/>
                 <w:szCs w:val="20"/>
               </w:rPr>
-              <w:t xml:space="preserve">«Atraso Comercial»</w:t>
+              <w:t>«Atraso Comercial»</w:t>
             </w:r>
           </w:p>
         </w:tc>
@@ -2036,7 +1752,7 @@
                 <w:sz w:val="20"/>
                 <w:szCs w:val="20"/>
               </w:rPr>
-              <w:t xml:space="preserve">La fecha de entrega aún no ha pasado</w:t>
+              <w:t>La fecha de entrega aún no ha pasado</w:t>
             </w:r>
           </w:p>
         </w:tc>
@@ -2059,7 +1775,7 @@
                 <w:sz w:val="20"/>
                 <w:szCs w:val="20"/>
               </w:rPr>
-              <w:t xml:space="preserve">«Pendiente de planificar»</w:t>
+              <w:t>«Pendiente de planificar»</w:t>
             </w:r>
           </w:p>
         </w:tc>
@@ -2087,7 +1803,7 @@
                 <w:sz w:val="20"/>
                 <w:szCs w:val="20"/>
               </w:rPr>
-              <w:t xml:space="preserve">En cualquier otro caso</w:t>
+              <w:t>En cualquier otro caso</w:t>
             </w:r>
           </w:p>
         </w:tc>
@@ -2110,17 +1826,12 @@
                 <w:sz w:val="20"/>
                 <w:szCs w:val="20"/>
               </w:rPr>
-              <w:t xml:space="preserve">«Atraso Planificacion»</w:t>
+              <w:t>«Atraso Planificacion»</w:t>
             </w:r>
           </w:p>
         </w:tc>
       </w:tr>
     </w:tbl>
-    <w:p>
-      <w:pPr>
-        <w:spacing w:after="60"/>
-      </w:pPr>
-    </w:p>
     <w:p>
       <w:pPr>
         <w:keepNext/>
@@ -2132,7 +1843,8 @@
           <w:bCs/>
           <w:color w:val="1F3864"/>
         </w:rPr>
-        <w:t xml:space="preserve">Caso 3. Sin stock reservado suficiente y con fecha de disponibilidad (ya planificado)</w:t>
+        <w:lastRenderedPageBreak/>
+        <w:t>Caso 3. Sin stock reservado suficiente y con fecha de disponibilidad (ya planificado)</w:t>
       </w:r>
     </w:p>
     <w:tbl>
@@ -2184,7 +1896,7 @@
                 <w:sz w:val="20"/>
                 <w:szCs w:val="20"/>
               </w:rPr>
-              <w:t xml:space="preserve">Condición</w:t>
+              <w:t>Condición</w:t>
             </w:r>
           </w:p>
         </w:tc>
@@ -2210,7 +1922,7 @@
                 <w:sz w:val="20"/>
                 <w:szCs w:val="20"/>
               </w:rPr>
-              <w:t xml:space="preserve">Tipo_Atraso</w:t>
+              <w:t>Tipo_Atraso</w:t>
             </w:r>
           </w:p>
         </w:tc>
@@ -2238,7 +1950,7 @@
                 <w:sz w:val="20"/>
                 <w:szCs w:val="20"/>
               </w:rPr>
-              <w:t xml:space="preserve">La fecha de disponibilidad actual llega a tiempo para la fecha de entrega</w:t>
+              <w:t>La fecha de disponibilidad actual llega a tiempo para la fecha de entrega</w:t>
             </w:r>
           </w:p>
         </w:tc>
@@ -2261,7 +1973,7 @@
                 <w:sz w:val="20"/>
                 <w:szCs w:val="20"/>
               </w:rPr>
-              <w:t xml:space="preserve">«Sin Atraso»</w:t>
+              <w:t>«Sin Atraso»</w:t>
             </w:r>
           </w:p>
         </w:tc>
@@ -2289,7 +2001,7 @@
                 <w:sz w:val="20"/>
                 <w:szCs w:val="20"/>
               </w:rPr>
-              <w:t xml:space="preserve">La fecha era errónea y la fecha de disponibilidad actual llega a tiempo para la fecha propuesta</w:t>
+              <w:t>La fecha era errónea y la fecha de disponibilidad actual llega a tiempo para la fecha propuesta</w:t>
             </w:r>
           </w:p>
         </w:tc>
@@ -2312,7 +2024,7 @@
                 <w:sz w:val="20"/>
                 <w:szCs w:val="20"/>
               </w:rPr>
-              <w:t xml:space="preserve">«Atraso Comercial»</w:t>
+              <w:t>«Atraso Comercial»</w:t>
             </w:r>
           </w:p>
         </w:tc>
@@ -2340,7 +2052,7 @@
                 <w:sz w:val="20"/>
                 <w:szCs w:val="20"/>
               </w:rPr>
-              <w:t xml:space="preserve">La primera fecha de disponibilidad no llegaba a tiempo ni para la entrega ni para la fecha propuesta</w:t>
+              <w:t>La primera fecha de disponibilidad no llegaba a tiempo ni para la entrega ni para la fecha propuesta</w:t>
             </w:r>
           </w:p>
         </w:tc>
@@ -2363,7 +2075,7 @@
                 <w:sz w:val="20"/>
                 <w:szCs w:val="20"/>
               </w:rPr>
-              <w:t xml:space="preserve">«Atraso Planificacion»</w:t>
+              <w:t>«Atraso Planificacion»</w:t>
             </w:r>
           </w:p>
         </w:tc>
@@ -2391,7 +2103,7 @@
                 <w:sz w:val="20"/>
                 <w:szCs w:val="20"/>
               </w:rPr>
-              <w:t xml:space="preserve">En cualquier otro caso</w:t>
+              <w:t>En cualquier otro caso</w:t>
             </w:r>
           </w:p>
         </w:tc>
@@ -2414,7 +2126,7 @@
                 <w:sz w:val="20"/>
                 <w:szCs w:val="20"/>
               </w:rPr>
-              <w:t xml:space="preserve">«Atraso Produccion»</w:t>
+              <w:t>«Atraso Produccion»</w:t>
             </w:r>
           </w:p>
         </w:tc>
@@ -2422,16 +2134,11 @@
     </w:tbl>
     <w:p>
       <w:pPr>
-        <w:spacing w:after="60"/>
-      </w:pPr>
-    </w:p>
-    <w:p>
-      <w:pPr>
         <w:pStyle w:val="Ttulo2"/>
         <w:jc w:val="both"/>
       </w:pPr>
       <w:r>
-        <w:t xml:space="preserve">2.4 Qué significa cada tipo</w:t>
+        <w:t>2.4 Qué significa cada tipo</w:t>
       </w:r>
     </w:p>
     <w:p>
@@ -2447,7 +2154,7 @@
           <w:b/>
           <w:bCs/>
         </w:rPr>
-        <w:t xml:space="preserve">Atraso Expedicion:</w:t>
+        <w:t>Atraso Expedicion:</w:t>
       </w:r>
       <w:r>
         <w:t xml:space="preserve"> el material estaba reservado al menos 2 días antes de la entrega, la fecha de entrega ya ha pasado y la posición no ha salido.</w:t>
@@ -2466,7 +2173,7 @@
           <w:b/>
           <w:bCs/>
         </w:rPr>
-        <w:t xml:space="preserve">Atraso Comercial:</w:t>
+        <w:t>Atraso Comercial:</w:t>
       </w:r>
       <w:r>
         <w:t xml:space="preserve"> el material llega tarde para la fecha de entrega, pero a tiempo para la fecha propuesta. El retraso se debe a que la fecha de entrega no era alcanzable.</w:t>
@@ -2485,7 +2192,7 @@
           <w:b/>
           <w:bCs/>
         </w:rPr>
-        <w:t xml:space="preserve">Atraso Planificacion:</w:t>
+        <w:t>Atraso Planificacion:</w:t>
       </w:r>
       <w:r>
         <w:t xml:space="preserve"> la primera fecha de disponibilidad ya llegaba tarde, o la posición ha vencido sin fecha de disponibilidad.</w:t>
@@ -2504,7 +2211,7 @@
           <w:b/>
           <w:bCs/>
         </w:rPr>
-        <w:t xml:space="preserve">Atraso Produccion:</w:t>
+        <w:t>Atraso Produccion:</w:t>
       </w:r>
       <w:r>
         <w:t xml:space="preserve"> la primera fecha de disponibilidad llegaba a tiempo y el material ha llegado, o va a llegar, más tarde.</w:t>
@@ -2523,7 +2230,7 @@
           <w:b/>
           <w:bCs/>
         </w:rPr>
-        <w:t xml:space="preserve">Pendiente de planificar:</w:t>
+        <w:t>Pendiente de planificar:</w:t>
       </w:r>
       <w:r>
         <w:t xml:space="preserve"> no es un atraso. La posición aún no tiene fecha de disponibilidad y la fecha de entrega no ha pasado.</w:t>
@@ -2542,7 +2249,7 @@
           <w:b/>
           <w:bCs/>
         </w:rPr>
-        <w:t xml:space="preserve">Sin Atraso:</w:t>
+        <w:t>Sin Atraso:</w:t>
       </w:r>
       <w:r>
         <w:t xml:space="preserve"> el material está reservado y la fecha de entrega no ha pasado, o la fecha de disponibilidad llega a tiempo para la entrega.</w:t>
@@ -2554,7 +2261,7 @@
         <w:jc w:val="both"/>
       </w:pPr>
       <w:r>
-        <w:t xml:space="preserve">2.5 Criterios</w:t>
+        <w:t>2.5 Criterios</w:t>
       </w:r>
     </w:p>
     <w:p>
@@ -2570,7 +2277,7 @@
           <w:b/>
           <w:bCs/>
         </w:rPr>
-        <w:t xml:space="preserve">Contra qué fecha se mide a planificación:</w:t>
+        <w:t>Contra qué fecha se mide a planificación:</w:t>
       </w:r>
       <w:r>
         <w:t xml:space="preserve"> contra la más tardía de la fecha de entrega y la fecha propuesta. Si la fecha no es errónea, contra la entrega; si es errónea, contra la propuesta.</w:t>
@@ -2589,7 +2296,7 @@
           <w:b/>
           <w:bCs/>
         </w:rPr>
-        <w:t xml:space="preserve">Fecha errónea con atraso de planificación o producción:</w:t>
+        <w:t>Fecha errónea con atraso de planificación o producción:</w:t>
       </w:r>
       <w:r>
         <w:t xml:space="preserve"> «Atraso Comercial» solo sale si el material llega a tiempo para la fecha propuesta. Si no llega ni para esa fecha, el tipo es «Atraso Planificacion» o «Atraso Produccion», aunque parte del retraso venga de la fecha errónea (los días entre la fecha de entrega y la fecha propuesta).</w:t>
@@ -2608,7 +2315,7 @@
           <w:b/>
           <w:bCs/>
         </w:rPr>
-        <w:t xml:space="preserve">Pedido pequeño de una familia sin planificar</w:t>
+        <w:t>Pedido pequeño de una familia sin planificar</w:t>
       </w:r>
       <w:r>
         <w:t xml:space="preserve"> (fecha errónea sin fecha propuesta): se toma como fecha propuesta la primera fecha de disponibilidad que dé planificación.</w:t>
@@ -2627,7 +2334,7 @@
           <w:b/>
           <w:bCs/>
         </w:rPr>
-        <w:t xml:space="preserve">Fecha errónea que se usa:</w:t>
+        <w:t>Fecha errónea que se usa:</w:t>
       </w:r>
       <w:r>
         <w:t xml:space="preserve"> la del día en que entró el pedido. Si se recalculara cada día, la fecha propuesta avanzaría con la planificación y acabaría pasando a «Atraso Comercial» atrasos que son de planificación.</w:t>
@@ -2646,7 +2353,7 @@
           <w:b/>
           <w:bCs/>
         </w:rPr>
-        <w:t xml:space="preserve">Atraso real y atraso previsto:</w:t>
+        <w:t>Atraso real y atraso previsto:</w:t>
       </w:r>
       <w:r>
         <w:t xml:space="preserve"> el tipo también se calcula para posiciones que aún no han vencido si ya se sabe que llegarán tarde. Para ver solo los atrasos reales, se filtra por fecha de entrega anterior a hoy.</w:t>
@@ -2661,7 +2368,7 @@
         </w:numPr>
       </w:pPr>
       <w:r>
-        <w:t xml:space="preserve">La cartera solo incluye posiciones abiertas con cantidad pendiente. Si la cantidad pendiente es 0, el pedido se debe cerrar.</w:t>
+        <w:t>La cartera solo incluye posiciones abiertas con cantidad pendiente. Si la cantidad pendiente es 0, el pedido se debe cerrar.</w:t>
       </w:r>
     </w:p>
     <w:p>
@@ -2673,28 +2380,7 @@
         </w:numPr>
       </w:pPr>
       <w:r>
-        <w:t xml:space="preserve">Toda reserva tiene fecha de reserva.</w:t>
-      </w:r>
-    </w:p>
-    <w:p>
-      <w:pPr>
-        <w:pStyle w:val="Ttulo1"/>
-      </w:pPr>
-      <w:r>
-        <w:lastRenderedPageBreak/>
-        <w:t xml:space="preserve">3. Pendiente de implementar</w:t>
-      </w:r>
-    </w:p>
-    <w:p>
-      <w:pPr>
-        <w:pStyle w:val="Prrafodelista"/>
-        <w:numPr>
-          <w:ilvl w:val="0"/>
-          <w:numId w:val="3"/>
-        </w:numPr>
-      </w:pPr>
-      <w:r>
-        <w:t xml:space="preserve">Están pendientes de pasar al script de Qlik el margen de 2 días y el plazo mínimo de 5 días en la fecha propuesta (apartado 1.2), la fecha errónea del día de entrada (apartado 1.5) y el cálculo del tipo de atraso (apartado 2). Hasta entonces la app sigue con el cálculo anterior.</w:t>
+        <w:t>Toda reserva tiene fecha de reserva.</w:t>
       </w:r>
     </w:p>
     <w:sectPr>

</xml_diff>